<commit_message>
docs: demo-mode results, screenshots, final video and rebuilt documents
- Every "Pending: requires OpenAI key" row now reads "Demo mode (pre-generated
  results)"; EVALUATION.md §2 says why (401 / 429 at submission) and what demo
  mode does. No AI latency or cost numbers are reported.
- Test tables updated (backend 183, frontend 233, live suite passing in demo mode).
- screenshots/: every main screen at desktop and phone width.
- Gallery 6-8: demo-mode plan, concept, suggestions and DIY.
- video/Roomify - Demo.mp4 (3:24) replaces the draft; AI scenes recorded in
  demo mode; team intro, closing slate and voice-over remain placeholders.
- CHECKLIST.md for v1.0.0; DEPLOYMENT.md status (blocked on Fly billing and a
  scoped AWS key); Devpost story states demo mode.
- final/ rebuilt with build.sh.

Co-Authored-By: Claude Opus 5.5 <noreply@anthropic.com>
</commit_message>
<xml_diff>
--- a/docs/submission/final/Roomify - Architecture.docx
+++ b/docs/submission/final/Roomify - Architecture.docx
@@ -37,7 +37,7 @@
         <w:br/>
       </w:r>
       <w:r>
-        <w:t xml:space="preserve">Release candidate v0.9.0-rc1</w:t>
+        <w:t xml:space="preserve">Release v1.0.0 (demo mode)</w:t>
       </w:r>
       <w:r>
         <w:br/>
@@ -1146,7 +1146,7 @@
         <w:pStyle w:val="FirstParagraph"/>
       </w:pPr>
       <w:r>
-        <w:t xml:space="preserve">This topology is a proposal; nothing has been deployed. Costs, steps and risks are in the Deployment</w:t>
+        <w:t xml:space="preserve">This topology is approved and configured but not yet deployed (Deployment has the blockers). Costs, steps and risks are in the Deployment</w:t>
       </w:r>
       <w:r>
         <w:t xml:space="preserve"> </w:t>
@@ -1347,7 +1347,7 @@
       <w:pStyle w:val="Footer"/>
     </w:pPr>
     <w:r>
-      <w:t xml:space="preserve">Release candidate v0.9.0-rc1 · 24 October 2026</w:t>
+      <w:t xml:space="preserve">Release v1.0.0 (demo mode) · 24 October 2026</w:t>
     </w:r>
     <w:r>
       <w:tab/>

</xml_diff>

<commit_message>
docs: live on Vercel (v1.0.1), final silent video, ONNX evaluation
- DEPLOYMENT.md: three Vercel projects + Neon, why (HF needs PRO, Koyeb a card,
  Render 512 MB, Fly a payment method), cold starts, upload limit, steps
- live URL in README, REPORT, CHECKLIST, DEVPOST_STORY, ARCHITECTURE
- EVALUATION: ONNX Runtime and the live Vercel service measured on the
  60-image set; live browser suite results
- video: no voice-over or placeholders; title card, captions, end card with the
  live URL; AI scenes as stills; recorded against the live deployment (2:43)
- keep-warm workflow (best effort) for judging
- final/ rebuilt with build.sh

Co-Authored-By: Claude Opus 5.5 <noreply@anthropic.com>
</commit_message>
<xml_diff>
--- a/docs/submission/final/Roomify - Architecture.docx
+++ b/docs/submission/final/Roomify - Architecture.docx
@@ -37,7 +37,7 @@
         <w:br/>
       </w:r>
       <w:r>
-        <w:t xml:space="preserve">Release v1.0.0 (demo mode)</w:t>
+        <w:t xml:space="preserve">Release v1.0.1 (live, demo mode)</w:t>
       </w:r>
       <w:r>
         <w:br/>
@@ -94,7 +94,7 @@
       <w:r>
         <w:drawing>
           <wp:inline>
-            <wp:extent cx="5334000" cy="4435928"/>
+            <wp:extent cx="5334000" cy="4333875"/>
             <wp:effectExtent b="0" l="0" r="0" t="0"/>
             <wp:docPr descr="Roomify system architecture: browser, Roomify frontend, Roomify API, Roomify CV service, OpenAI, PostgreSQL and object storage." title="" id="11" name="Picture"/>
             <a:graphic>
@@ -115,7 +115,7 @@
                   <pic:spPr bwMode="auto">
                     <a:xfrm>
                       <a:off x="0" y="0"/>
-                      <a:ext cx="5334000" cy="4435928"/>
+                      <a:ext cx="5334000" cy="4333875"/>
                     </a:xfrm>
                     <a:prstGeom prst="rect">
                       <a:avLst/>
@@ -324,7 +324,7 @@
               <w:pStyle w:val="Compact"/>
             </w:pPr>
             <w:r>
-              <w:t xml:space="preserve">Flyway migrations V1–V10</w:t>
+              <w:t xml:space="preserve">Flyway migrations V1–V12</w:t>
             </w:r>
           </w:p>
         </w:tc>
@@ -1016,7 +1016,7 @@
               <w:pStyle w:val="Compact"/>
             </w:pPr>
             <w:r>
-              <w:t xml:space="preserve">No public address; its</w:t>
+              <w:t xml:space="preserve">Detection endpoints require a bearer token known only to the backend (it is publicly reachable on Vercel); its</w:t>
             </w:r>
             <w:r>
               <w:t xml:space="preserve"> </w:t>
@@ -1080,9 +1080,9 @@
       <w:pPr>
         <w:pStyle w:val="Heading1"/>
       </w:pPr>
-      <w:bookmarkStart w:id="22" w:name="_e8ab66b7d85b7ea8cb0dd53e02b8e2b34609149"/>
-      <w:r>
-        <w:t xml:space="preserve">Deployment topology (proposed)</w:t>
+      <w:bookmarkStart w:id="22" w:name="_ce321175ac3ef385eaa96256f23f0795b3dd308"/>
+      <w:r>
+        <w:t xml:space="preserve">Deployment topology (live)</w:t>
       </w:r>
       <w:bookmarkEnd w:id="22"/>
     </w:p>
@@ -1093,9 +1093,9 @@
       <w:r>
         <w:drawing>
           <wp:inline>
-            <wp:extent cx="5334000" cy="1925410"/>
+            <wp:extent cx="5334000" cy="1387928"/>
             <wp:effectExtent b="0" l="0" r="0" t="0"/>
-            <wp:docPr descr="Proposed Roomify deployment: Vercel for the frontend, Fly.io for the API and a private CV service, Neon Postgres and the existing S3 bucket." title="" id="24" name="Picture"/>
+            <wp:docPr descr="Roomify live deployment: three Vercel projects (Next.js frontend, Spring Boot container, FastAPI CV function) and Neon Postgres." title="" id="24" name="Picture"/>
             <a:graphic>
               <a:graphicData uri="http://schemas.openxmlformats.org/drawingml/2006/picture">
                 <pic:pic>
@@ -1114,7 +1114,7 @@
                   <pic:spPr bwMode="auto">
                     <a:xfrm>
                       <a:off x="0" y="0"/>
-                      <a:ext cx="5334000" cy="1925410"/>
+                      <a:ext cx="5334000" cy="1387928"/>
                     </a:xfrm>
                     <a:prstGeom prst="rect">
                       <a:avLst/>
@@ -1138,7 +1138,7 @@
         <w:pStyle w:val="ImageCaption"/>
       </w:pPr>
       <w:r>
-        <w:t xml:space="preserve">Figure 4. Proposed Roomify deployment: Vercel for the frontend, Fly.io for the API and a private CV service, Neon Postgres and the existing S3 bucket.</w:t>
+        <w:t xml:space="preserve">Figure 4. Roomify live deployment: three Vercel projects (Next.js frontend, Spring Boot container, FastAPI CV function) and Neon Postgres.</w:t>
       </w:r>
     </w:p>
     <w:p>
@@ -1146,24 +1146,53 @@
         <w:pStyle w:val="FirstParagraph"/>
       </w:pPr>
       <w:r>
-        <w:t xml:space="preserve">This topology is approved and configured but not yet deployed (Deployment has the blockers). Costs, steps and risks are in the Deployment</w:t>
+        <w:t xml:space="preserve">Live at</w:t>
       </w:r>
       <w:r>
         <w:t xml:space="preserve"> </w:t>
       </w:r>
-      <w:r>
-        <w:t xml:space="preserve">document.</w:t>
+      <w:hyperlink r:id="rId26">
+        <w:r>
+          <w:rPr>
+            <w:rStyle w:val="Hyperlink"/>
+          </w:rPr>
+          <w:t xml:space="preserve">https://roomify-rooms.vercel.app</w:t>
+        </w:r>
+      </w:hyperlink>
+      <w:r>
+        <w:t xml:space="preserve"> </w:t>
+      </w:r>
+      <w:r>
+        <w:t xml:space="preserve">on free plans with no payment card: the Next.js frontend, the</w:t>
+      </w:r>
+      <w:r>
+        <w:t xml:space="preserve"> </w:t>
+      </w:r>
+      <w:r>
+        <w:t xml:space="preserve">Spring Boot API (Vercel Container Runtime) and the CV service (Vercel Python Function, YOLO11n on ONNX</w:t>
+      </w:r>
+      <w:r>
+        <w:t xml:space="preserve"> </w:t>
+      </w:r>
+      <w:r>
+        <w:t xml:space="preserve">Runtime) are three Vercel projects; Postgres on Neon holds the data and the photos. Reasons, cold-start</w:t>
+      </w:r>
+      <w:r>
+        <w:t xml:space="preserve"> </w:t>
+      </w:r>
+      <w:r>
+        <w:t xml:space="preserve">behaviour, steps and the Fly.io alternative are in the Deployment document.</w:t>
       </w:r>
     </w:p>
     <w:p>
       <w:pPr>
         <w:pStyle w:val="Heading1"/>
       </w:pPr>
-      <w:bookmarkStart w:id="26" w:name="_82f97f74b8194aaa6c8211ea84a624cfd102335"/>
+      <w:bookmarkStart w:id="27" w:name="_82f97f74b8194aaa6c8211ea84a624cfd102335"/>
       <w:r>
         <w:t xml:space="preserve">Architectural decisions</w:t>
       </w:r>
-      <w:bookmarkEnd w:id="26"/>
+      <w:bookmarkEnd w:id="27"/>
     </w:p>
     <w:tbl>
       <w:tblPr>
@@ -1221,7 +1250,7 @@
               <w:pStyle w:val="Compact"/>
             </w:pPr>
             <w:r>
-              <w:t xml:space="preserve">Keeps PyTorch out of the JVM host, lets the CV service stay private, and lets each part scale or be replaced independently</w:t>
+              <w:t xml:space="preserve">Keeps the vision runtime out of the JVM host and lets each part scale, deploy or be replaced independently (the CV service moved from torch to ONNX Runtime for hosting without touching the backend)</w:t>
             </w:r>
           </w:p>
         </w:tc>
@@ -1347,7 +1376,7 @@
       <w:pStyle w:val="Footer"/>
     </w:pPr>
     <w:r>
-      <w:t xml:space="preserve">Release v1.0.0 (demo mode) · 24 October 2026</w:t>
+      <w:t xml:space="preserve">Release v1.0.1 (live, demo mode) · 24 October 2026</w:t>
     </w:r>
     <w:r>
       <w:tab/>

</xml_diff>

<commit_message>
docs: live on Vercel (v1.0.1), final silent video, ONNX evaluation (#58)
- DEPLOYMENT.md: three Vercel projects + Neon, why (HF needs PRO, Koyeb a card,
  Render 512 MB, Fly a payment method), cold starts, upload limit, steps
- live URL in README, REPORT, CHECKLIST, DEVPOST_STORY, ARCHITECTURE
- EVALUATION: ONNX Runtime and the live Vercel service measured on the
  60-image set; live browser suite results
- video: no voice-over or placeholders; title card, captions, end card with the
  live URL; AI scenes as stills; recorded against the live deployment (2:43)
- keep-warm workflow (best effort) for judging
- final/ rebuilt with build.sh

Co-authored-by: Claude Opus 5.5 <noreply@anthropic.com>
</commit_message>
<xml_diff>
--- a/docs/submission/final/Roomify - Architecture.docx
+++ b/docs/submission/final/Roomify - Architecture.docx
@@ -37,7 +37,7 @@
         <w:br/>
       </w:r>
       <w:r>
-        <w:t xml:space="preserve">Release v1.0.0 (demo mode)</w:t>
+        <w:t xml:space="preserve">Release v1.0.1 (live, demo mode)</w:t>
       </w:r>
       <w:r>
         <w:br/>
@@ -94,7 +94,7 @@
       <w:r>
         <w:drawing>
           <wp:inline>
-            <wp:extent cx="5334000" cy="4435928"/>
+            <wp:extent cx="5334000" cy="4333875"/>
             <wp:effectExtent b="0" l="0" r="0" t="0"/>
             <wp:docPr descr="Roomify system architecture: browser, Roomify frontend, Roomify API, Roomify CV service, OpenAI, PostgreSQL and object storage." title="" id="11" name="Picture"/>
             <a:graphic>
@@ -115,7 +115,7 @@
                   <pic:spPr bwMode="auto">
                     <a:xfrm>
                       <a:off x="0" y="0"/>
-                      <a:ext cx="5334000" cy="4435928"/>
+                      <a:ext cx="5334000" cy="4333875"/>
                     </a:xfrm>
                     <a:prstGeom prst="rect">
                       <a:avLst/>
@@ -324,7 +324,7 @@
               <w:pStyle w:val="Compact"/>
             </w:pPr>
             <w:r>
-              <w:t xml:space="preserve">Flyway migrations V1–V10</w:t>
+              <w:t xml:space="preserve">Flyway migrations V1–V12</w:t>
             </w:r>
           </w:p>
         </w:tc>
@@ -1016,7 +1016,7 @@
               <w:pStyle w:val="Compact"/>
             </w:pPr>
             <w:r>
-              <w:t xml:space="preserve">No public address; its</w:t>
+              <w:t xml:space="preserve">Detection endpoints require a bearer token known only to the backend (it is publicly reachable on Vercel); its</w:t>
             </w:r>
             <w:r>
               <w:t xml:space="preserve"> </w:t>
@@ -1080,9 +1080,9 @@
       <w:pPr>
         <w:pStyle w:val="Heading1"/>
       </w:pPr>
-      <w:bookmarkStart w:id="22" w:name="_e8ab66b7d85b7ea8cb0dd53e02b8e2b34609149"/>
-      <w:r>
-        <w:t xml:space="preserve">Deployment topology (proposed)</w:t>
+      <w:bookmarkStart w:id="22" w:name="_ce321175ac3ef385eaa96256f23f0795b3dd308"/>
+      <w:r>
+        <w:t xml:space="preserve">Deployment topology (live)</w:t>
       </w:r>
       <w:bookmarkEnd w:id="22"/>
     </w:p>
@@ -1093,9 +1093,9 @@
       <w:r>
         <w:drawing>
           <wp:inline>
-            <wp:extent cx="5334000" cy="1925410"/>
+            <wp:extent cx="5334000" cy="1387928"/>
             <wp:effectExtent b="0" l="0" r="0" t="0"/>
-            <wp:docPr descr="Proposed Roomify deployment: Vercel for the frontend, Fly.io for the API and a private CV service, Neon Postgres and the existing S3 bucket." title="" id="24" name="Picture"/>
+            <wp:docPr descr="Roomify live deployment: three Vercel projects (Next.js frontend, Spring Boot container, FastAPI CV function) and Neon Postgres." title="" id="24" name="Picture"/>
             <a:graphic>
               <a:graphicData uri="http://schemas.openxmlformats.org/drawingml/2006/picture">
                 <pic:pic>
@@ -1114,7 +1114,7 @@
                   <pic:spPr bwMode="auto">
                     <a:xfrm>
                       <a:off x="0" y="0"/>
-                      <a:ext cx="5334000" cy="1925410"/>
+                      <a:ext cx="5334000" cy="1387928"/>
                     </a:xfrm>
                     <a:prstGeom prst="rect">
                       <a:avLst/>
@@ -1138,7 +1138,7 @@
         <w:pStyle w:val="ImageCaption"/>
       </w:pPr>
       <w:r>
-        <w:t xml:space="preserve">Figure 4. Proposed Roomify deployment: Vercel for the frontend, Fly.io for the API and a private CV service, Neon Postgres and the existing S3 bucket.</w:t>
+        <w:t xml:space="preserve">Figure 4. Roomify live deployment: three Vercel projects (Next.js frontend, Spring Boot container, FastAPI CV function) and Neon Postgres.</w:t>
       </w:r>
     </w:p>
     <w:p>
@@ -1146,24 +1146,53 @@
         <w:pStyle w:val="FirstParagraph"/>
       </w:pPr>
       <w:r>
-        <w:t xml:space="preserve">This topology is approved and configured but not yet deployed (Deployment has the blockers). Costs, steps and risks are in the Deployment</w:t>
+        <w:t xml:space="preserve">Live at</w:t>
       </w:r>
       <w:r>
         <w:t xml:space="preserve"> </w:t>
       </w:r>
-      <w:r>
-        <w:t xml:space="preserve">document.</w:t>
+      <w:hyperlink r:id="rId26">
+        <w:r>
+          <w:rPr>
+            <w:rStyle w:val="Hyperlink"/>
+          </w:rPr>
+          <w:t xml:space="preserve">https://roomify-rooms.vercel.app</w:t>
+        </w:r>
+      </w:hyperlink>
+      <w:r>
+        <w:t xml:space="preserve"> </w:t>
+      </w:r>
+      <w:r>
+        <w:t xml:space="preserve">on free plans with no payment card: the Next.js frontend, the</w:t>
+      </w:r>
+      <w:r>
+        <w:t xml:space="preserve"> </w:t>
+      </w:r>
+      <w:r>
+        <w:t xml:space="preserve">Spring Boot API (Vercel Container Runtime) and the CV service (Vercel Python Function, YOLO11n on ONNX</w:t>
+      </w:r>
+      <w:r>
+        <w:t xml:space="preserve"> </w:t>
+      </w:r>
+      <w:r>
+        <w:t xml:space="preserve">Runtime) are three Vercel projects; Postgres on Neon holds the data and the photos. Reasons, cold-start</w:t>
+      </w:r>
+      <w:r>
+        <w:t xml:space="preserve"> </w:t>
+      </w:r>
+      <w:r>
+        <w:t xml:space="preserve">behaviour, steps and the Fly.io alternative are in the Deployment document.</w:t>
       </w:r>
     </w:p>
     <w:p>
       <w:pPr>
         <w:pStyle w:val="Heading1"/>
       </w:pPr>
-      <w:bookmarkStart w:id="26" w:name="_82f97f74b8194aaa6c8211ea84a624cfd102335"/>
+      <w:bookmarkStart w:id="27" w:name="_82f97f74b8194aaa6c8211ea84a624cfd102335"/>
       <w:r>
         <w:t xml:space="preserve">Architectural decisions</w:t>
       </w:r>
-      <w:bookmarkEnd w:id="26"/>
+      <w:bookmarkEnd w:id="27"/>
     </w:p>
     <w:tbl>
       <w:tblPr>
@@ -1221,7 +1250,7 @@
               <w:pStyle w:val="Compact"/>
             </w:pPr>
             <w:r>
-              <w:t xml:space="preserve">Keeps PyTorch out of the JVM host, lets the CV service stay private, and lets each part scale or be replaced independently</w:t>
+              <w:t xml:space="preserve">Keeps the vision runtime out of the JVM host and lets each part scale, deploy or be replaced independently (the CV service moved from torch to ONNX Runtime for hosting without touching the backend)</w:t>
             </w:r>
           </w:p>
         </w:tc>
@@ -1347,7 +1376,7 @@
       <w:pStyle w:val="Footer"/>
     </w:pPr>
     <w:r>
-      <w:t xml:space="preserve">Release v1.0.0 (demo mode) · 24 October 2026</w:t>
+      <w:t xml:space="preserve">Release v1.0.1 (live, demo mode) · 24 October 2026</w:t>
     </w:r>
     <w:r>
       <w:tab/>

</xml_diff>